<commit_message>
feat(ml): integrate trained Scikit-learn pipelines into backend, update UI presets, and add caselink-ml training suite
</commit_message>
<xml_diff>
--- a/aicte-irccip/docs/components.docx
+++ b/aicte-irccip/docs/components.docx
@@ -227,13 +227,17 @@
     </w:p>
     <w:p>
       <w:r>
-        <w:t>Protects whistleblower identities in compliance with Section 4(1) of the DPDP Act 2023:</w:t>
+        <w:t>Protects whistleblower identities in compliance with Section 4(1) of the DPDP Act 2023 and delivers explainable decision intelligence:</w:t>
         <w:br/>
-        <w:t>• Converts Aadhaar, mobile, and email credentials into salted, irreversible HMAC-SHA256 tokens upon intake.</w:t>
+        <w:t>• Irreversible Salted Blind Indexing: Converts Aadhaar, mobile, and email credentials into salted, irreversible HMAC-SHA256 tokens upon intake.</w:t>
         <w:br/>
-        <w:t>• Cross-bureau duplicate detection matches complaint grievance text and document hashes without exposing whistleblower PII across department borders.</w:t>
+        <w:t>• Scikit-Learn Complaint Category Classifier: Production-loaded .joblib pipeline (TfidfVectorizer + LogisticRegression) classifying text into 6 regulatory domains with confidence scoring.</w:t>
         <w:br/>
-        <w:t>• Explainable AI classifies complaint categories, predicts priority tiers, and suggests statutory handling bureaus with transparent confidence metrics.</w:t>
+        <w:t>• Priority Severity Predictor: Automated triage model mapping grievance substance to High, Medium, or Low priority with emergency safety overrides.</w:t>
+        <w:br/>
+        <w:t>• Cosine Deduplication Engine: Real-time TF-IDF vectorizer comparing submissions against historical dockets (threshold &gt;= 0.70 flags duplication) without exposing whistleblower PII across department borders.</w:t>
+        <w:br/>
+        <w:t>• Statutory Bureau Routing: Maps categorized grievances directly to designated bureau cells (e.g., PGRC Student Fees, RB Infrastructure, RB Faculty Affairs).</w:t>
       </w:r>
     </w:p>
     <w:sectPr>

</xml_diff>

<commit_message>
docs: synchronize all architecture docs, completed_up_until_now report, solu/components/tech stack specifications, and 1-click launcher instructions
</commit_message>
<xml_diff>
--- a/aicte-irccip/docs/components.docx
+++ b/aicte-irccip/docs/components.docx
@@ -208,9 +208,9 @@
     </w:p>
     <w:p>
       <w:r>
-        <w:t>Enables zero-disruption integration with legacy government portals (PGRC, CPGRAMS, Approval Bureau):</w:t>
+        <w:t>Enables zero-disruption integration with legacy government portals (PGRC, CPGRAMS, Approval Bureau) through a 3-tier gateway:</w:t>
         <w:br/>
-        <w:t>• Mode 1 (Real-Time Webhook / REST Push): Ingests payloads immediately upon citizen petition submission.</w:t>
+        <w:t>• Mode 1 (Real-Time Webhook / REST Push): Ingests payloads immediately upon citizen petition submission (&lt;80ms latency). Features a live dashboard simulator with 1-click scenario presets and reactive UI state updates (instant KPI counter increment, glowing table row highlight, and persistent notification banner).</w:t>
         <w:br/>
         <w:t>• Mode 2 (Scheduled Event-Driven Polling): Performs delta queries against bureau read-replicas hourly.</w:t>
         <w:br/>

</xml_diff>